<commit_message>
Use approved carrier application template
</commit_message>
<xml_diff>
--- a/crm/assets/carrier_application_template.docx
+++ b/crm/assets/carrier_application_template.docx
@@ -9,7 +9,8 @@
         <w:tblLook w:val="04A0" w:firstRow="1" w:lastRow="0" w:firstColumn="1" w:lastColumn="0" w:noHBand="0" w:noVBand="1"/>
       </w:tblPr>
       <w:tblGrid>
-        <w:gridCol w:w="5063"/>
+        <w:gridCol w:w="4933"/>
+        <w:gridCol w:w="130"/>
         <w:gridCol w:w="4803"/>
       </w:tblGrid>
       <w:tr>
@@ -20,6 +21,7 @@
         <w:tc>
           <w:tcPr>
             <w:tcW w:w="2566" w:type="pct"/>
+            <w:gridSpan w:val="2"/>
             <w:tcMar>
               <w:top w:w="65" w:type="dxa"/>
               <w:left w:w="75" w:type="dxa"/>
@@ -29,268 +31,40 @@
           </w:tcPr>
           <w:p>
             <w:pPr>
-              <w:spacing w:after="0" w:line="20" w:lineRule="exact"/>
+              <w:spacing w:after="120"/>
+              <w:rPr>
+                <w:lang w:val="ru-RU"/>
+              </w:rPr>
             </w:pPr>
-          </w:p>
-          <w:p>
-            <w:pPr>
-              <w:spacing w:after="120"/>
-              <w:rPr>
-                <w:sz w:val="20"/>
-                <w:szCs w:val="20"/>
-                <w:lang w:val="ru-RU"/>
-              </w:rPr>
-            </w:pPr>
-            <w:r>
-              <w:rPr>
-                <w:b/>
-                <w:sz w:val="20"/>
-                <w:szCs w:val="20"/>
-                <w:lang w:val="ru-RU"/>
-              </w:rPr>
-              <w:t>ООО "НОВЫЙ ПРОЕКТ"</w:t>
-            </w:r>
-          </w:p>
-          <w:p>
-            <w:pPr>
-              <w:spacing w:after="0"/>
+            <w:r>
+              <w:rPr>
+                <w:sz w:val="16"/>
+                <w:lang w:val="ru-RU"/>
+              </w:rPr>
+              <w:br/>
+              <w:t>Ответственный менеджер: Виктор Масленчев</w:t>
+            </w:r>
+            <w:r>
+              <w:rPr>
+                <w:sz w:val="16"/>
+                <w:lang w:val="ru-RU"/>
+              </w:rPr>
+              <w:br/>
+              <w:t>Телефон: +7 921 926-20-24</w:t>
+            </w:r>
+            <w:r>
+              <w:rPr>
+                <w:sz w:val="16"/>
+                <w:lang w:val="ru-RU"/>
+              </w:rPr>
+              <w:br/>
+              <w:t>E-mail: logist@newproject-spb.ru</w:t>
+            </w:r>
+            <w:r>
               <w:rPr>
                 <w:sz w:val="16"/>
                 <w:szCs w:val="16"/>
                 <w:lang w:val="ru-RU"/>
-              </w:rPr>
-            </w:pPr>
-            <w:r>
-              <w:rPr>
-                <w:sz w:val="16"/>
-                <w:szCs w:val="16"/>
-                <w:lang w:val="ru-RU"/>
-              </w:rPr>
-              <w:t>ИНН 7804496014 КПП 781401001 ОГРН 1127847212345</w:t>
-            </w:r>
-            <w:r>
-              <w:rPr>
-                <w:sz w:val="16"/>
-                <w:szCs w:val="16"/>
-                <w:lang w:val="ru-RU"/>
-              </w:rPr>
-              <w:br/>
-            </w:r>
-            <w:r>
-              <w:rPr>
-                <w:sz w:val="16"/>
-                <w:szCs w:val="16"/>
-                <w:lang w:val="ru-RU"/>
-              </w:rPr>
-              <w:t xml:space="preserve">Адрес: 197349, </w:t>
-            </w:r>
-            <w:r>
-              <w:rPr>
-                <w:sz w:val="16"/>
-                <w:szCs w:val="16"/>
-                <w:lang w:val="ru-RU"/>
-              </w:rPr>
-              <w:t>Санкт-Петербург г.</w:t>
-            </w:r>
-            <w:r>
-              <w:rPr>
-                <w:sz w:val="16"/>
-                <w:szCs w:val="16"/>
-                <w:lang w:val="ru-RU"/>
-              </w:rPr>
-              <w:t>, П</w:t>
-            </w:r>
-            <w:r>
-              <w:rPr>
-                <w:sz w:val="16"/>
-                <w:szCs w:val="16"/>
-                <w:lang w:val="ru-RU"/>
-              </w:rPr>
-              <w:t>риморский р-н</w:t>
-            </w:r>
-            <w:r>
-              <w:rPr>
-                <w:sz w:val="16"/>
-                <w:szCs w:val="16"/>
-                <w:lang w:val="ru-RU"/>
-              </w:rPr>
-              <w:t>, У</w:t>
-            </w:r>
-            <w:r>
-              <w:rPr>
-                <w:sz w:val="16"/>
-                <w:szCs w:val="16"/>
-                <w:lang w:val="ru-RU"/>
-              </w:rPr>
-              <w:t>точкина ул</w:t>
-            </w:r>
-            <w:r>
-              <w:rPr>
-                <w:sz w:val="16"/>
-                <w:szCs w:val="16"/>
-                <w:lang w:val="ru-RU"/>
-              </w:rPr>
-              <w:t xml:space="preserve">., </w:t>
-            </w:r>
-            <w:r>
-              <w:rPr>
-                <w:sz w:val="16"/>
-                <w:szCs w:val="16"/>
-                <w:lang w:val="ru-RU"/>
-              </w:rPr>
-              <w:t>д.</w:t>
-            </w:r>
-            <w:r>
-              <w:rPr>
-                <w:sz w:val="16"/>
-                <w:szCs w:val="16"/>
-                <w:lang w:val="ru-RU"/>
-              </w:rPr>
-              <w:t xml:space="preserve"> 3, </w:t>
-            </w:r>
-            <w:r>
-              <w:rPr>
-                <w:sz w:val="16"/>
-                <w:szCs w:val="16"/>
-                <w:lang w:val="ru-RU"/>
-              </w:rPr>
-              <w:t>корп</w:t>
-            </w:r>
-            <w:r>
-              <w:rPr>
-                <w:sz w:val="16"/>
-                <w:szCs w:val="16"/>
-                <w:lang w:val="ru-RU"/>
-              </w:rPr>
-              <w:t xml:space="preserve">. 1 </w:t>
-            </w:r>
-            <w:r>
-              <w:rPr>
-                <w:sz w:val="16"/>
-                <w:szCs w:val="16"/>
-                <w:lang w:val="ru-RU"/>
-              </w:rPr>
-              <w:t>лит</w:t>
-            </w:r>
-            <w:r>
-              <w:rPr>
-                <w:sz w:val="16"/>
-                <w:szCs w:val="16"/>
-                <w:lang w:val="ru-RU"/>
-              </w:rPr>
-              <w:t xml:space="preserve">. А, </w:t>
-            </w:r>
-            <w:r>
-              <w:rPr>
-                <w:sz w:val="16"/>
-                <w:szCs w:val="16"/>
-                <w:lang w:val="ru-RU"/>
-              </w:rPr>
-              <w:t>оф</w:t>
-            </w:r>
-            <w:r>
-              <w:rPr>
-                <w:sz w:val="16"/>
-                <w:szCs w:val="16"/>
-                <w:lang w:val="ru-RU"/>
-              </w:rPr>
-              <w:t>. 310</w:t>
-            </w:r>
-            <w:r>
-              <w:rPr>
-                <w:sz w:val="16"/>
-                <w:szCs w:val="16"/>
-                <w:lang w:val="ru-RU"/>
-              </w:rPr>
-              <w:br/>
-            </w:r>
-            <w:proofErr w:type="spellStart"/>
-            <w:r>
-              <w:rPr>
-                <w:sz w:val="16"/>
-                <w:szCs w:val="16"/>
-              </w:rPr>
-              <w:t>Контакт</w:t>
-            </w:r>
-            <w:proofErr w:type="spellEnd"/>
-            <w:r>
-              <w:rPr>
-                <w:sz w:val="16"/>
-                <w:szCs w:val="16"/>
-                <w:lang w:val="ru-RU"/>
-              </w:rPr>
-              <w:t>: +7 921 926-20-24</w:t>
-            </w:r>
-          </w:p>
-          <w:p>
-            <w:pPr>
-              <w:spacing w:after="0"/>
-              <w:rPr>
-                <w:sz w:val="16"/>
-                <w:szCs w:val="16"/>
-                <w:lang w:val="ru-RU"/>
-              </w:rPr>
-            </w:pPr>
-            <w:r>
-              <w:rPr>
-                <w:sz w:val="16"/>
-                <w:szCs w:val="16"/>
-              </w:rPr>
-              <w:t xml:space="preserve">E-mail: </w:t>
-            </w:r>
-            <w:r>
-              <w:rPr>
-                <w:sz w:val="16"/>
-                <w:szCs w:val="16"/>
-              </w:rPr>
-              <w:t>office</w:t>
-            </w:r>
-            <w:r>
-              <w:rPr>
-                <w:sz w:val="16"/>
-                <w:szCs w:val="16"/>
-              </w:rPr>
-              <w:t>@</w:t>
-            </w:r>
-            <w:r>
-              <w:rPr>
-                <w:sz w:val="16"/>
-                <w:szCs w:val="16"/>
-              </w:rPr>
-              <w:t>newproject</w:t>
-            </w:r>
-            <w:r>
-              <w:rPr>
-                <w:sz w:val="16"/>
-                <w:szCs w:val="16"/>
-              </w:rPr>
-              <w:t>-</w:t>
-            </w:r>
-            <w:r>
-              <w:rPr>
-                <w:sz w:val="16"/>
-                <w:szCs w:val="16"/>
-              </w:rPr>
-              <w:t>spb</w:t>
-            </w:r>
-            <w:r>
-              <w:rPr>
-                <w:sz w:val="16"/>
-                <w:szCs w:val="16"/>
-              </w:rPr>
-              <w:t>.</w:t>
-            </w:r>
-            <w:r>
-              <w:rPr>
-                <w:sz w:val="16"/>
-                <w:szCs w:val="16"/>
-              </w:rPr>
-              <w:t>ru</w:t>
-            </w:r>
-            <w:r>
-              <w:rPr>
-                <w:sz w:val="16"/>
-                <w:szCs w:val="16"/>
               </w:rPr>
               <w:t xml:space="preserve"> </w:t>
             </w:r>
@@ -309,6 +83,9 @@
           <w:p>
             <w:pPr>
               <w:spacing w:after="0" w:line="20" w:lineRule="exact"/>
+              <w:rPr>
+                <w:lang w:val="ru-RU"/>
+              </w:rPr>
             </w:pPr>
           </w:p>
           <w:p>
@@ -325,35 +102,15 @@
                 <w:sz w:val="36"/>
                 <w:lang w:val="ru-RU"/>
               </w:rPr>
-              <w:t xml:space="preserve">ЗАЯВКА </w:t>
-            </w:r>
-            <w:proofErr w:type="gramStart"/>
+              <w:t>ЗАЯВКА № РС-2026-00082</w:t>
+            </w:r>
             <w:r>
               <w:rPr>
                 <w:b/>
-                <w:sz w:val="36"/>
-                <w:lang w:val="ru-RU"/>
-              </w:rPr>
-              <w:t xml:space="preserve">№ </w:t>
-            </w:r>
-            <w:r>
-              <w:rPr>
-                <w:b/>
-                <w:sz w:val="36"/>
-                <w:lang w:val="ru-RU"/>
-              </w:rPr>
-              <w:t>0000-000123</w:t>
-            </w:r>
-            <w:proofErr w:type="gramEnd"/>
-          </w:p>
-          <w:p>
-            <w:pPr>
-              <w:spacing w:after="0"/>
-              <w:jc w:val="right"/>
-              <w:rPr>
-                <w:lang w:val="ru-RU"/>
-              </w:rPr>
-            </w:pPr>
+                <w:lang w:val="ru-RU"/>
+              </w:rPr>
+              <w:t xml:space="preserve"> </w:t>
+            </w:r>
             <w:r>
               <w:rPr>
                 <w:sz w:val="16"/>
@@ -367,54 +124,11 @@
                 <w:lang w:val="ru-RU"/>
               </w:rPr>
               <w:br/>
-              <w:t xml:space="preserve">к договору </w:t>
-            </w:r>
-            <w:proofErr w:type="gramStart"/>
-            <w:r>
-              <w:rPr>
-                <w:sz w:val="16"/>
-                <w:lang w:val="ru-RU"/>
-              </w:rPr>
-              <w:t xml:space="preserve">№ </w:t>
-            </w:r>
-            <w:r>
-              <w:rPr>
-                <w:sz w:val="16"/>
-                <w:lang w:val="ru-RU"/>
-              </w:rPr>
-              <w:t>0000-000321</w:t>
-            </w:r>
-            <w:proofErr w:type="gramEnd"/>
-            <w:r>
-              <w:rPr>
-                <w:sz w:val="16"/>
-                <w:lang w:val="ru-RU"/>
-              </w:rPr>
-              <w:t xml:space="preserve"> от 01.10.2026</w:t>
+              <w:t>к договору № ДП-2026-0001 от 01.10.2026</w:t>
             </w:r>
           </w:p>
         </w:tc>
       </w:tr>
-    </w:tbl>
-    <w:p>
-      <w:pPr>
-        <w:spacing w:before="160" w:after="180"/>
-        <w:rPr>
-          <w:lang w:val="ru-RU"/>
-        </w:rPr>
-      </w:pPr>
-    </w:p>
-    <w:tbl>
-      <w:tblPr>
-        <w:tblW w:w="0" w:type="auto"/>
-        <w:jc w:val="center"/>
-        <w:tblLayout w:type="fixed"/>
-        <w:tblLook w:val="04A0" w:firstRow="1" w:lastRow="0" w:firstColumn="1" w:lastColumn="0" w:noHBand="0" w:noVBand="1"/>
-      </w:tblPr>
-      <w:tblGrid>
-        <w:gridCol w:w="5443"/>
-        <w:gridCol w:w="4422"/>
-      </w:tblGrid>
       <w:tr>
         <w:trPr>
           <w:cantSplit/>
@@ -422,7 +136,7 @@
         </w:trPr>
         <w:tc>
           <w:tcPr>
-            <w:tcW w:w="5443" w:type="dxa"/>
+            <w:tcW w:w="2500" w:type="pct"/>
             <w:tcBorders>
               <w:right w:val="single" w:sz="4" w:space="0" w:color="D0D2D4"/>
             </w:tcBorders>
@@ -454,12 +168,15 @@
                 <w:sz w:val="16"/>
                 <w:lang w:val="ru-RU"/>
               </w:rPr>
-              <w:t>ИСПОЛНИТЕЛЬ / ПЕРЕВОЗЧИК</w:t>
+              <w:t>ЗАКАЗЧИК</w:t>
             </w:r>
           </w:p>
           <w:p>
             <w:pPr>
-              <w:rPr>
+              <w:spacing w:after="120"/>
+              <w:rPr>
+                <w:sz w:val="20"/>
+                <w:szCs w:val="20"/>
                 <w:lang w:val="ru-RU"/>
               </w:rPr>
             </w:pPr>
@@ -467,100 +184,183 @@
               <w:rPr>
                 <w:b/>
                 <w:sz w:val="20"/>
-                <w:lang w:val="ru-RU"/>
-              </w:rPr>
-              <w:t xml:space="preserve">ООО </w:t>
-            </w:r>
-            <w:r>
-              <w:rPr>
-                <w:b/>
-                <w:sz w:val="20"/>
-                <w:lang w:val="ru-RU"/>
-              </w:rPr>
-              <w:t>"ДЕМО ТРАНС"</w:t>
+                <w:szCs w:val="20"/>
+                <w:lang w:val="ru-RU"/>
+              </w:rPr>
+              <w:t>ООО "НОВЫЙ ПРОЕКТ"</w:t>
             </w:r>
           </w:p>
           <w:p>
             <w:pPr>
               <w:spacing w:after="0"/>
               <w:rPr>
+                <w:sz w:val="16"/>
+                <w:szCs w:val="16"/>
                 <w:lang w:val="ru-RU"/>
               </w:rPr>
             </w:pPr>
             <w:r>
               <w:rPr>
                 <w:sz w:val="16"/>
-                <w:lang w:val="ru-RU"/>
-              </w:rPr>
-              <w:t>ИНН 0000000000</w:t>
+                <w:szCs w:val="16"/>
+                <w:lang w:val="ru-RU"/>
+              </w:rPr>
+              <w:t xml:space="preserve">ИНН 7804496014, КПП 781401001, ОГРН 1127847589418, </w:t>
             </w:r>
             <w:r>
               <w:rPr>
                 <w:sz w:val="16"/>
-                <w:lang w:val="ru-RU"/>
-              </w:rPr>
-              <w:t xml:space="preserve"> </w:t>
+                <w:szCs w:val="16"/>
+                <w:lang w:val="ru-RU"/>
+              </w:rPr>
+              <w:br/>
+              <w:t xml:space="preserve">Адрес: 197349, </w:t>
             </w:r>
             <w:r>
               <w:rPr>
                 <w:sz w:val="16"/>
-                <w:lang w:val="ru-RU"/>
-              </w:rPr>
-              <w:t>КПП 000000000</w:t>
+                <w:szCs w:val="16"/>
+                <w:lang w:val="ru-RU"/>
+              </w:rPr>
+              <w:t>С</w:t>
             </w:r>
             <w:r>
               <w:rPr>
                 <w:sz w:val="16"/>
-                <w:lang w:val="ru-RU"/>
-              </w:rPr>
-              <w:t xml:space="preserve"> </w:t>
+                <w:szCs w:val="16"/>
+                <w:lang w:val="ru-RU"/>
+              </w:rPr>
+              <w:t>анкт-</w:t>
             </w:r>
             <w:r>
               <w:rPr>
                 <w:sz w:val="16"/>
-                <w:lang w:val="ru-RU"/>
-              </w:rPr>
-              <w:t>ОГРН 0000000000000</w:t>
+                <w:szCs w:val="16"/>
+                <w:lang w:val="ru-RU"/>
+              </w:rPr>
+              <w:t>П</w:t>
             </w:r>
             <w:r>
               <w:rPr>
                 <w:sz w:val="16"/>
+                <w:szCs w:val="16"/>
+                <w:lang w:val="ru-RU"/>
+              </w:rPr>
+              <w:t xml:space="preserve">етербург г., </w:t>
+            </w:r>
+            <w:r>
+              <w:rPr>
+                <w:sz w:val="16"/>
+                <w:szCs w:val="16"/>
+                <w:lang w:val="ru-RU"/>
+              </w:rPr>
+              <w:t>П</w:t>
+            </w:r>
+            <w:r>
+              <w:rPr>
+                <w:sz w:val="16"/>
+                <w:szCs w:val="16"/>
+                <w:lang w:val="ru-RU"/>
+              </w:rPr>
+              <w:t xml:space="preserve">риморский р-н, </w:t>
+            </w:r>
+            <w:r>
+              <w:rPr>
+                <w:sz w:val="16"/>
+                <w:szCs w:val="16"/>
+                <w:lang w:val="ru-RU"/>
+              </w:rPr>
+              <w:t>У</w:t>
+            </w:r>
+            <w:r>
+              <w:rPr>
+                <w:sz w:val="16"/>
+                <w:szCs w:val="16"/>
+                <w:lang w:val="ru-RU"/>
+              </w:rPr>
+              <w:t>точкина ул., д. 3, корп. 1 лит. а, оф. 310</w:t>
+            </w:r>
+            <w:r>
+              <w:rPr>
+                <w:sz w:val="16"/>
+                <w:szCs w:val="16"/>
                 <w:lang w:val="ru-RU"/>
               </w:rPr>
               <w:br/>
-              <w:t xml:space="preserve">Адрес: Санкт-Петербург, ул. </w:t>
+              <w:t>Контакт: +7 921 926-20-</w:t>
             </w:r>
             <w:r>
               <w:rPr>
                 <w:sz w:val="16"/>
-                <w:lang w:val="ru-RU"/>
-              </w:rPr>
-              <w:t>Примерная, 10</w:t>
-            </w:r>
+                <w:szCs w:val="16"/>
+                <w:lang w:val="ru-RU"/>
+              </w:rPr>
+              <w:t>24</w:t>
+            </w:r>
+          </w:p>
+          <w:p>
+            <w:pPr>
+              <w:spacing w:after="0"/>
+              <w:rPr>
+                <w:lang w:val="ru-RU"/>
+              </w:rPr>
+            </w:pPr>
             <w:r>
               <w:rPr>
                 <w:sz w:val="16"/>
-                <w:lang w:val="ru-RU"/>
-              </w:rPr>
-              <w:br/>
-              <w:t>Контакт: +7 000 000-00-01</w:t>
+                <w:szCs w:val="16"/>
+              </w:rPr>
+              <w:t>E</w:t>
             </w:r>
             <w:r>
               <w:rPr>
                 <w:sz w:val="16"/>
-                <w:lang w:val="ru-RU"/>
-              </w:rPr>
-              <w:br/>
+                <w:szCs w:val="16"/>
+                <w:lang w:val="ru-RU"/>
+              </w:rPr>
+              <w:t>-</w:t>
             </w:r>
             <w:r>
               <w:rPr>
                 <w:sz w:val="16"/>
-              </w:rPr>
-              <w:t>E</w:t>
+                <w:szCs w:val="16"/>
+              </w:rPr>
+              <w:t>mail</w:t>
             </w:r>
             <w:r>
               <w:rPr>
                 <w:sz w:val="16"/>
+                <w:szCs w:val="16"/>
+                <w:lang w:val="ru-RU"/>
+              </w:rPr>
+              <w:t xml:space="preserve">: </w:t>
+            </w:r>
+            <w:r>
+              <w:rPr>
+                <w:sz w:val="16"/>
+                <w:szCs w:val="16"/>
+              </w:rPr>
+              <w:t>mail</w:t>
+            </w:r>
+            <w:r>
+              <w:rPr>
+                <w:sz w:val="16"/>
+                <w:szCs w:val="16"/>
+                <w:lang w:val="ru-RU"/>
+              </w:rPr>
+              <w:t>@</w:t>
+            </w:r>
+            <w:r>
+              <w:rPr>
+                <w:sz w:val="16"/>
+                <w:szCs w:val="16"/>
+              </w:rPr>
+              <w:t>newproject</w:t>
+            </w:r>
+            <w:r>
+              <w:rPr>
+                <w:sz w:val="16"/>
+                <w:szCs w:val="16"/>
                 <w:lang w:val="ru-RU"/>
               </w:rPr>
               <w:t>-</w:t>
@@ -568,53 +368,31 @@
             <w:r>
               <w:rPr>
                 <w:sz w:val="16"/>
-              </w:rPr>
-              <w:t>mail</w:t>
+                <w:szCs w:val="16"/>
+              </w:rPr>
+              <w:t>spb</w:t>
             </w:r>
             <w:r>
               <w:rPr>
                 <w:sz w:val="16"/>
-                <w:lang w:val="ru-RU"/>
-              </w:rPr>
-              <w:t xml:space="preserve">: </w:t>
+                <w:szCs w:val="16"/>
+                <w:lang w:val="ru-RU"/>
+              </w:rPr>
+              <w:t>.</w:t>
             </w:r>
             <w:r>
               <w:rPr>
                 <w:sz w:val="16"/>
-              </w:rPr>
-              <w:t>transport</w:t>
-            </w:r>
-            <w:r>
-              <w:rPr>
-                <w:sz w:val="16"/>
-                <w:lang w:val="ru-RU"/>
-              </w:rPr>
-              <w:t>@</w:t>
-            </w:r>
-            <w:r>
-              <w:rPr>
-                <w:sz w:val="16"/>
-              </w:rPr>
-              <w:t>example</w:t>
-            </w:r>
-            <w:r>
-              <w:rPr>
-                <w:sz w:val="16"/>
-                <w:lang w:val="ru-RU"/>
-              </w:rPr>
-              <w:t>.</w:t>
-            </w:r>
-            <w:r>
-              <w:rPr>
-                <w:sz w:val="16"/>
-              </w:rPr>
-              <w:t>com</w:t>
+                <w:szCs w:val="16"/>
+              </w:rPr>
+              <w:t>ru</w:t>
             </w:r>
           </w:p>
         </w:tc>
         <w:tc>
           <w:tcPr>
-            <w:tcW w:w="4422" w:type="dxa"/>
+            <w:tcW w:w="2500" w:type="pct"/>
+            <w:gridSpan w:val="2"/>
             <w:tcMar>
               <w:top w:w="65" w:type="dxa"/>
               <w:left w:w="75" w:type="dxa"/>
@@ -632,6 +410,14 @@
           </w:p>
           <w:p>
             <w:pPr>
+              <w:spacing w:after="0" w:line="20" w:lineRule="exact"/>
+              <w:rPr>
+                <w:lang w:val="ru-RU"/>
+              </w:rPr>
+            </w:pPr>
+          </w:p>
+          <w:p>
+            <w:pPr>
               <w:spacing w:after="120"/>
               <w:rPr>
                 <w:lang w:val="ru-RU"/>
@@ -643,257 +429,62 @@
                 <w:sz w:val="16"/>
                 <w:lang w:val="ru-RU"/>
               </w:rPr>
-              <w:t>РЕКВИЗИТЫ ЗАЯВКИ</w:t>
+              <w:t>ПЕРЕВОЗЧИК</w:t>
+            </w:r>
+          </w:p>
+          <w:p>
+            <w:pPr>
+              <w:rPr>
+                <w:lang w:val="ru-RU"/>
+              </w:rPr>
+            </w:pPr>
+            <w:r>
+              <w:rPr>
+                <w:b/>
+                <w:sz w:val="20"/>
+                <w:lang w:val="ru-RU"/>
+              </w:rPr>
+              <w:t>ИП Никиточкина Ольга Сергеевна</w:t>
             </w:r>
           </w:p>
           <w:p>
             <w:pPr>
               <w:spacing w:after="0"/>
               <w:rPr>
+                <w:lang w:val="ru-RU"/>
+              </w:rPr>
+            </w:pPr>
+            <w:r>
+              <w:rPr>
                 <w:sz w:val="16"/>
                 <w:lang w:val="ru-RU"/>
               </w:rPr>
-            </w:pPr>
+              <w:t>ИНН 731800984723, ОГРН 324237500109012</w:t>
+            </w:r>
             <w:r>
               <w:rPr>
                 <w:sz w:val="16"/>
                 <w:lang w:val="ru-RU"/>
               </w:rPr>
-              <w:t xml:space="preserve">Рейс / внутренний </w:t>
-            </w:r>
-            <w:proofErr w:type="gramStart"/>
+              <w:br/>
+              <w:t>Адрес: не указан</w:t>
+            </w:r>
             <w:r>
               <w:rPr>
                 <w:sz w:val="16"/>
                 <w:lang w:val="ru-RU"/>
               </w:rPr>
-              <w:t xml:space="preserve">№ </w:t>
+              <w:br/>
+              <w:t>Контакт: Никиточкина Ольга Сергеевна / +7 910 941-50-64</w:t>
             </w:r>
             <w:r>
               <w:rPr>
                 <w:sz w:val="16"/>
                 <w:lang w:val="ru-RU"/>
               </w:rPr>
-              <w:t>0000-000123</w:t>
-            </w:r>
-            <w:proofErr w:type="gramEnd"/>
-          </w:p>
-          <w:p>
-            <w:pPr>
-              <w:spacing w:after="0"/>
-              <w:rPr>
-                <w:lang w:val="ru-RU"/>
-              </w:rPr>
-            </w:pPr>
-            <w:r>
-              <w:rPr>
-                <w:sz w:val="16"/>
-                <w:lang w:val="ru-RU"/>
-              </w:rPr>
-              <w:t>Маршрут: Санкт-Петербург – Санкт-Петербург</w:t>
-            </w:r>
-            <w:r>
-              <w:rPr>
-                <w:sz w:val="16"/>
-                <w:lang w:val="ru-RU"/>
-              </w:rPr>
               <w:br/>
-              <w:t>Дата перевозки: 06</w:t>
-            </w:r>
-            <w:r>
-              <w:rPr>
-                <w:sz w:val="16"/>
-                <w:lang w:val="ru-RU"/>
-              </w:rPr>
-              <w:t xml:space="preserve">.10.2026 - </w:t>
-            </w:r>
-            <w:r>
-              <w:rPr>
-                <w:sz w:val="16"/>
-                <w:lang w:val="ru-RU"/>
-              </w:rPr>
-              <w:t>07.10.2026</w:t>
-            </w:r>
-            <w:r>
-              <w:rPr>
-                <w:sz w:val="16"/>
-                <w:lang w:val="ru-RU"/>
-              </w:rPr>
-              <w:br/>
-            </w:r>
-            <w:r>
-              <w:rPr>
-                <w:sz w:val="16"/>
-                <w:lang w:val="ru-RU"/>
-              </w:rPr>
-              <w:t>Ответственный менеджер</w:t>
-            </w:r>
-            <w:r>
-              <w:rPr>
-                <w:sz w:val="16"/>
-                <w:lang w:val="ru-RU"/>
-              </w:rPr>
-              <w:t xml:space="preserve">: </w:t>
-            </w:r>
-            <w:r>
-              <w:rPr>
-                <w:sz w:val="16"/>
-                <w:lang w:val="ru-RU"/>
-              </w:rPr>
-              <w:t xml:space="preserve">Виктор </w:t>
-            </w:r>
-            <w:proofErr w:type="spellStart"/>
-            <w:r>
-              <w:rPr>
-                <w:sz w:val="16"/>
-                <w:lang w:val="ru-RU"/>
-              </w:rPr>
-              <w:t>Масленчев</w:t>
-            </w:r>
-            <w:proofErr w:type="spellEnd"/>
-            <w:r>
-              <w:rPr>
-                <w:sz w:val="16"/>
-                <w:lang w:val="ru-RU"/>
-              </w:rPr>
-              <w:br/>
-              <w:t xml:space="preserve">Телефон: +7 </w:t>
-            </w:r>
-            <w:r>
-              <w:rPr>
-                <w:sz w:val="16"/>
-                <w:lang w:val="ru-RU"/>
-              </w:rPr>
-              <w:t>921</w:t>
-            </w:r>
-            <w:r>
-              <w:rPr>
-                <w:sz w:val="16"/>
-                <w:lang w:val="ru-RU"/>
-              </w:rPr>
-              <w:t xml:space="preserve"> </w:t>
-            </w:r>
-            <w:r>
-              <w:rPr>
-                <w:sz w:val="16"/>
-                <w:lang w:val="ru-RU"/>
-              </w:rPr>
-              <w:t>926</w:t>
-            </w:r>
-            <w:r>
-              <w:rPr>
-                <w:sz w:val="16"/>
-                <w:lang w:val="ru-RU"/>
-              </w:rPr>
-              <w:t>-</w:t>
-            </w:r>
-            <w:r>
-              <w:rPr>
-                <w:sz w:val="16"/>
-                <w:lang w:val="ru-RU"/>
-              </w:rPr>
-              <w:t>20</w:t>
-            </w:r>
-            <w:r>
-              <w:rPr>
-                <w:sz w:val="16"/>
-                <w:lang w:val="ru-RU"/>
-              </w:rPr>
-              <w:t>-</w:t>
-            </w:r>
-            <w:r>
-              <w:rPr>
-                <w:sz w:val="16"/>
-                <w:lang w:val="ru-RU"/>
-              </w:rPr>
-              <w:t>24</w:t>
-            </w:r>
-            <w:r>
-              <w:rPr>
-                <w:sz w:val="16"/>
-                <w:lang w:val="ru-RU"/>
-              </w:rPr>
-              <w:br/>
-            </w:r>
-            <w:r>
-              <w:rPr>
-                <w:sz w:val="16"/>
-              </w:rPr>
-              <w:t>E</w:t>
-            </w:r>
-            <w:r>
-              <w:rPr>
-                <w:sz w:val="16"/>
-                <w:lang w:val="ru-RU"/>
-              </w:rPr>
-              <w:t>-</w:t>
-            </w:r>
-            <w:r>
-              <w:rPr>
-                <w:sz w:val="16"/>
-              </w:rPr>
-              <w:t>mail</w:t>
-            </w:r>
-            <w:r>
-              <w:rPr>
-                <w:sz w:val="16"/>
-                <w:lang w:val="ru-RU"/>
-              </w:rPr>
-              <w:t xml:space="preserve">: </w:t>
-            </w:r>
-            <w:proofErr w:type="spellStart"/>
-            <w:r>
-              <w:rPr>
-                <w:sz w:val="16"/>
-              </w:rPr>
-              <w:t>logist</w:t>
-            </w:r>
-            <w:proofErr w:type="spellEnd"/>
-            <w:r>
-              <w:rPr>
-                <w:sz w:val="16"/>
-                <w:lang w:val="ru-RU"/>
-              </w:rPr>
-              <w:t>@</w:t>
-            </w:r>
-            <w:proofErr w:type="spellStart"/>
-            <w:r>
-              <w:rPr>
-                <w:sz w:val="16"/>
-              </w:rPr>
-              <w:t>newproject</w:t>
-            </w:r>
-            <w:proofErr w:type="spellEnd"/>
-            <w:r>
-              <w:rPr>
-                <w:sz w:val="16"/>
-                <w:lang w:val="ru-RU"/>
-              </w:rPr>
-              <w:t>-</w:t>
-            </w:r>
-            <w:proofErr w:type="spellStart"/>
-            <w:r>
-              <w:rPr>
-                <w:sz w:val="16"/>
-              </w:rPr>
-              <w:t>spb</w:t>
-            </w:r>
-            <w:proofErr w:type="spellEnd"/>
-            <w:r>
-              <w:rPr>
-                <w:sz w:val="16"/>
-                <w:lang w:val="ru-RU"/>
-              </w:rPr>
-              <w:t>.</w:t>
-            </w:r>
-            <w:proofErr w:type="spellStart"/>
-            <w:r>
-              <w:rPr>
-                <w:sz w:val="16"/>
-              </w:rPr>
-              <w:t>ru</w:t>
-            </w:r>
-            <w:proofErr w:type="spellEnd"/>
+              <w:t>E-mail: 89181541785@mail.ru</w:t>
+            </w:r>
           </w:p>
         </w:tc>
       </w:tr>
@@ -904,18 +495,25 @@
           <w:bottom w:val="single" w:sz="4" w:space="6" w:color="D0D2D4"/>
         </w:pBdr>
         <w:spacing w:before="220" w:after="120"/>
+        <w:rPr>
+          <w:sz w:val="16"/>
+          <w:szCs w:val="16"/>
+        </w:rPr>
       </w:pPr>
       <w:r>
         <w:rPr>
           <w:b/>
           <w:color w:val="B82832"/>
+          <w:sz w:val="16"/>
+          <w:szCs w:val="16"/>
         </w:rPr>
         <w:t xml:space="preserve">01 </w:t>
       </w:r>
       <w:r>
         <w:rPr>
           <w:b/>
-          <w:sz w:val="20"/>
+          <w:sz w:val="16"/>
+          <w:szCs w:val="16"/>
         </w:rPr>
         <w:t>ИНФОРМАЦИЯ О ГРУЗЕ</w:t>
       </w:r>
@@ -928,11 +526,11 @@
         <w:tblLook w:val="04A0" w:firstRow="1" w:lastRow="0" w:firstColumn="1" w:lastColumn="0" w:noHBand="0" w:noVBand="1"/>
       </w:tblPr>
       <w:tblGrid>
-        <w:gridCol w:w="1133"/>
-        <w:gridCol w:w="1134"/>
-        <w:gridCol w:w="1710"/>
-        <w:gridCol w:w="2826"/>
-        <w:gridCol w:w="3061"/>
+        <w:gridCol w:w="1972"/>
+        <w:gridCol w:w="1973"/>
+        <w:gridCol w:w="2009"/>
+        <w:gridCol w:w="1937"/>
+        <w:gridCol w:w="1973"/>
       </w:tblGrid>
       <w:tr>
         <w:trPr>
@@ -941,8 +539,8 @@
         </w:trPr>
         <w:tc>
           <w:tcPr>
-            <w:tcW w:w="6803" w:type="dxa"/>
-            <w:gridSpan w:val="4"/>
+            <w:tcW w:w="5954" w:type="dxa"/>
+            <w:gridSpan w:val="3"/>
             <w:tcBorders>
               <w:bottom w:val="single" w:sz="4" w:space="0" w:color="D0D2D4"/>
             </w:tcBorders>
@@ -982,20 +580,25 @@
             <w:pPr>
               <w:spacing w:after="100"/>
               <w:rPr>
+                <w:sz w:val="16"/>
+                <w:szCs w:val="16"/>
                 <w:lang w:val="ru-RU"/>
               </w:rPr>
             </w:pPr>
             <w:r>
               <w:rPr>
-                <w:lang w:val="ru-RU"/>
-              </w:rPr>
-              <w:t>Бумажная упаковка: коробки и пакеты</w:t>
+                <w:sz w:val="16"/>
+                <w:szCs w:val="16"/>
+                <w:lang w:val="ru-RU"/>
+              </w:rPr>
+              <w:t>Декорации / стройматериалы</w:t>
             </w:r>
           </w:p>
         </w:tc>
         <w:tc>
           <w:tcPr>
-            <w:tcW w:w="3061" w:type="dxa"/>
+            <w:tcW w:w="3910" w:type="dxa"/>
+            <w:gridSpan w:val="2"/>
             <w:tcBorders>
               <w:bottom w:val="single" w:sz="4" w:space="0" w:color="D0D2D4"/>
             </w:tcBorders>
@@ -1017,12 +620,19 @@
           <w:p>
             <w:pPr>
               <w:spacing w:after="60"/>
-            </w:pPr>
-            <w:r>
               <w:rPr>
                 <w:b/>
                 <w:color w:val="74777B"/>
                 <w:sz w:val="14"/>
+                <w:lang w:val="ru-RU"/>
+              </w:rPr>
+            </w:pPr>
+            <w:r>
+              <w:rPr>
+                <w:b/>
+                <w:color w:val="74777B"/>
+                <w:sz w:val="14"/>
+                <w:lang w:val="ru-RU"/>
               </w:rPr>
               <w:t>УПАКОВКА</w:t>
             </w:r>
@@ -1030,12 +640,18 @@
           <w:p>
             <w:pPr>
               <w:spacing w:after="100"/>
+              <w:rPr>
+                <w:sz w:val="16"/>
+                <w:szCs w:val="16"/>
+              </w:rPr>
             </w:pPr>
             <w:r>
               <w:rPr>
-                <w:lang w:val="ru-RU"/>
-              </w:rPr>
-              <w:t>Паллет 1,2 х 0,8 м</w:t>
+                <w:sz w:val="16"/>
+                <w:szCs w:val="16"/>
+                <w:lang w:val="ru-RU"/>
+              </w:rPr>
+              <w:t>Без упаковки</w:t>
             </w:r>
           </w:p>
         </w:tc>
@@ -1047,7 +663,7 @@
         </w:trPr>
         <w:tc>
           <w:tcPr>
-            <w:tcW w:w="1133" w:type="dxa"/>
+            <w:tcW w:w="1972" w:type="dxa"/>
             <w:tcBorders>
               <w:bottom w:val="single" w:sz="4" w:space="0" w:color="D0D2D4"/>
             </w:tcBorders>
@@ -1079,15 +695,38 @@
           <w:p>
             <w:pPr>
               <w:spacing w:after="100"/>
+              <w:rPr>
+                <w:sz w:val="16"/>
+                <w:szCs w:val="16"/>
+              </w:rPr>
             </w:pPr>
             <w:r>
-              <w:t>8 400</w:t>
+              <w:rPr>
+                <w:sz w:val="16"/>
+                <w:szCs w:val="16"/>
+              </w:rPr>
+              <w:t>15</w:t>
+            </w:r>
+            <w:r>
+              <w:rPr>
+                <w:sz w:val="16"/>
+                <w:szCs w:val="16"/>
+                <w:lang w:val="ru-RU"/>
+              </w:rPr>
+              <w:t xml:space="preserve"> </w:t>
+            </w:r>
+            <w:r>
+              <w:rPr>
+                <w:sz w:val="16"/>
+                <w:szCs w:val="16"/>
+              </w:rPr>
+              <w:t>000</w:t>
             </w:r>
           </w:p>
         </w:tc>
         <w:tc>
           <w:tcPr>
-            <w:tcW w:w="1134" w:type="dxa"/>
+            <w:tcW w:w="1973" w:type="dxa"/>
             <w:tcBorders>
               <w:bottom w:val="single" w:sz="4" w:space="0" w:color="D0D2D4"/>
             </w:tcBorders>
@@ -1136,15 +775,23 @@
           <w:p>
             <w:pPr>
               <w:spacing w:after="100"/>
+              <w:rPr>
+                <w:sz w:val="16"/>
+                <w:szCs w:val="16"/>
+              </w:rPr>
             </w:pPr>
             <w:r>
-              <w:t>54</w:t>
+              <w:rPr>
+                <w:sz w:val="16"/>
+                <w:szCs w:val="16"/>
+              </w:rPr>
+              <w:t>82</w:t>
             </w:r>
           </w:p>
         </w:tc>
         <w:tc>
           <w:tcPr>
-            <w:tcW w:w="1710" w:type="dxa"/>
+            <w:tcW w:w="2009" w:type="dxa"/>
             <w:tcBorders>
               <w:bottom w:val="single" w:sz="4" w:space="0" w:color="D0D2D4"/>
             </w:tcBorders>
@@ -1203,18 +850,24 @@
               <w:rPr>
                 <w:b/>
                 <w:color w:val="74777B"/>
-                <w:sz w:val="14"/>
+                <w:sz w:val="16"/>
+                <w:szCs w:val="16"/>
                 <w:lang w:val="ru-RU"/>
               </w:rPr>
             </w:pPr>
             <w:r>
-              <w:t>24</w:t>
+              <w:rPr>
+                <w:sz w:val="16"/>
+                <w:szCs w:val="16"/>
+                <w:lang w:val="ru-RU"/>
+              </w:rPr>
+              <w:t>Не указано</w:t>
             </w:r>
           </w:p>
         </w:tc>
         <w:tc>
           <w:tcPr>
-            <w:tcW w:w="2826" w:type="dxa"/>
+            <w:tcW w:w="1937" w:type="dxa"/>
             <w:tcBorders>
               <w:bottom w:val="single" w:sz="4" w:space="0" w:color="D0D2D4"/>
             </w:tcBorders>
@@ -1248,11 +901,15 @@
             <w:pPr>
               <w:spacing w:after="100"/>
               <w:rPr>
+                <w:sz w:val="16"/>
+                <w:szCs w:val="16"/>
                 <w:lang w:val="ru-RU"/>
               </w:rPr>
             </w:pPr>
             <w:r>
               <w:rPr>
+                <w:sz w:val="16"/>
+                <w:szCs w:val="16"/>
                 <w:lang w:val="ru-RU"/>
               </w:rPr>
               <w:t>Не требуется</w:t>
@@ -1261,7 +918,7 @@
         </w:tc>
         <w:tc>
           <w:tcPr>
-            <w:tcW w:w="3061" w:type="dxa"/>
+            <w:tcW w:w="1973" w:type="dxa"/>
             <w:tcBorders>
               <w:bottom w:val="single" w:sz="4" w:space="0" w:color="D0D2D4"/>
             </w:tcBorders>
@@ -1309,20 +966,79 @@
             <w:pPr>
               <w:spacing w:after="100"/>
               <w:rPr>
+                <w:sz w:val="16"/>
+                <w:szCs w:val="16"/>
                 <w:lang w:val="ru-RU"/>
               </w:rPr>
             </w:pPr>
             <w:r>
               <w:rPr>
-                <w:lang w:val="ru-RU"/>
-              </w:rPr>
-              <w:t xml:space="preserve">Не </w:t>
-            </w:r>
-            <w:r>
-              <w:rPr>
-                <w:lang w:val="ru-RU"/>
-              </w:rPr>
-              <w:t>относится</w:t>
+                <w:sz w:val="16"/>
+                <w:szCs w:val="16"/>
+                <w:lang w:val="ru-RU"/>
+              </w:rPr>
+              <w:t>Не относится</w:t>
+            </w:r>
+          </w:p>
+        </w:tc>
+      </w:tr>
+      <w:tr>
+        <w:trPr>
+          <w:cantSplit/>
+          <w:jc w:val="center"/>
+        </w:trPr>
+        <w:tc>
+          <w:tcPr>
+            <w:tcW w:w="9864" w:type="dxa"/>
+            <w:gridSpan w:val="5"/>
+            <w:tcBorders>
+              <w:bottom w:val="single" w:sz="4" w:space="0" w:color="D0D2D4"/>
+            </w:tcBorders>
+            <w:tcMar>
+              <w:top w:w="65" w:type="dxa"/>
+              <w:left w:w="75" w:type="dxa"/>
+              <w:bottom w:w="65" w:type="dxa"/>
+              <w:right w:w="75" w:type="dxa"/>
+            </w:tcMar>
+          </w:tcPr>
+          <w:p>
+            <w:pPr>
+              <w:spacing w:after="0" w:line="20" w:lineRule="exact"/>
+              <w:rPr>
+                <w:lang w:val="ru-RU"/>
+              </w:rPr>
+            </w:pPr>
+          </w:p>
+          <w:p>
+            <w:pPr>
+              <w:spacing w:after="60"/>
+              <w:rPr>
+                <w:lang w:val="ru-RU"/>
+              </w:rPr>
+            </w:pPr>
+            <w:r>
+              <w:rPr>
+                <w:b/>
+                <w:color w:val="74777B"/>
+                <w:sz w:val="14"/>
+                <w:lang w:val="ru-RU"/>
+              </w:rPr>
+              <w:t>ОСОБЫЕ ТРЕБОВАНИЯ К ГРУЗУ</w:t>
+            </w:r>
+          </w:p>
+          <w:p>
+            <w:pPr>
+              <w:spacing w:before="80" w:after="0"/>
+              <w:rPr>
+                <w:lang w:val="ru-RU"/>
+              </w:rPr>
+            </w:pPr>
+            <w:r>
+              <w:rPr>
+                <w:sz w:val="16"/>
+                <w:lang w:val="ru-RU"/>
+              </w:rPr>
+              <w:t>сухой чистый кузов; беречь от влаги; не штабелировать.</w:t>
             </w:r>
           </w:p>
         </w:tc>
@@ -1330,37 +1046,29 @@
     </w:tbl>
     <w:p>
       <w:pPr>
-        <w:spacing w:before="80" w:after="0"/>
-        <w:rPr>
-          <w:lang w:val="ru-RU"/>
-        </w:rPr>
-      </w:pPr>
-      <w:r>
-        <w:rPr>
-          <w:sz w:val="16"/>
-          <w:lang w:val="ru-RU"/>
-        </w:rPr>
-        <w:t>Особые требования к грузу: сухой чистый кузов; беречь от влаги; не штабелировать.</w:t>
-      </w:r>
-    </w:p>
-    <w:p>
-      <w:pPr>
         <w:pBdr>
           <w:bottom w:val="single" w:sz="4" w:space="6" w:color="D0D2D4"/>
         </w:pBdr>
         <w:spacing w:before="220" w:after="120"/>
+        <w:rPr>
+          <w:sz w:val="16"/>
+          <w:szCs w:val="16"/>
+        </w:rPr>
       </w:pPr>
       <w:r>
         <w:rPr>
           <w:b/>
           <w:color w:val="B82832"/>
+          <w:sz w:val="16"/>
+          <w:szCs w:val="16"/>
         </w:rPr>
         <w:t xml:space="preserve">02 </w:t>
       </w:r>
       <w:r>
         <w:rPr>
           <w:b/>
-          <w:sz w:val="20"/>
+          <w:sz w:val="16"/>
+          <w:szCs w:val="16"/>
         </w:rPr>
         <w:t>МАРШРУТ</w:t>
       </w:r>
@@ -1402,12 +1110,17 @@
           <w:p>
             <w:pPr>
               <w:spacing w:before="80" w:after="60"/>
+              <w:rPr>
+                <w:sz w:val="14"/>
+                <w:szCs w:val="14"/>
+              </w:rPr>
             </w:pPr>
             <w:r>
               <w:rPr>
                 <w:b/>
                 <w:color w:val="B82832"/>
-                <w:sz w:val="16"/>
+                <w:sz w:val="14"/>
+                <w:szCs w:val="14"/>
               </w:rPr>
               <w:t xml:space="preserve">ПОГРУЗКА </w:t>
             </w:r>
@@ -1415,7 +1128,8 @@
               <w:rPr>
                 <w:b/>
                 <w:color w:val="auto"/>
-                <w:sz w:val="16"/>
+                <w:sz w:val="14"/>
+                <w:szCs w:val="14"/>
               </w:rPr>
               <w:t>01</w:t>
             </w:r>
@@ -1423,19 +1137,27 @@
           <w:p>
             <w:pPr>
               <w:spacing w:after="40"/>
+              <w:rPr>
+                <w:sz w:val="16"/>
+                <w:szCs w:val="16"/>
+              </w:rPr>
             </w:pPr>
             <w:r>
               <w:rPr>
+                <w:b/>
+                <w:bCs/>
                 <w:sz w:val="16"/>
-              </w:rPr>
-              <w:t>06.10.2026</w:t>
+                <w:szCs w:val="16"/>
+              </w:rPr>
+              <w:t>05.10.2026</w:t>
             </w:r>
             <w:r>
               <w:rPr>
                 <w:sz w:val="16"/>
+                <w:szCs w:val="16"/>
               </w:rPr>
               <w:br/>
-              <w:t>09:00 – 11:00</w:t>
+              <w:t>09:00 12:00</w:t>
             </w:r>
           </w:p>
         </w:tc>
@@ -1486,17 +1208,7 @@
                 <w:szCs w:val="16"/>
                 <w:lang w:val="ru-RU"/>
               </w:rPr>
-              <w:t xml:space="preserve">ООО </w:t>
-            </w:r>
-            <w:r>
-              <w:rPr>
-                <w:b/>
-                <w:bCs/>
-                <w:sz w:val="16"/>
-                <w:szCs w:val="16"/>
-                <w:lang w:val="ru-RU"/>
-              </w:rPr>
-              <w:t>"НОВЫЙ ПРОЕКТ"</w:t>
+              <w:t>АНО "НЕВСКИЙ БАТАЛИСТ"</w:t>
             </w:r>
           </w:p>
           <w:p>
@@ -1513,7 +1225,7 @@
                 <w:szCs w:val="16"/>
                 <w:lang w:val="ru-RU"/>
               </w:rPr>
-              <w:t>Адрес: Санкт-Петербург, ул. Учебная, 12, склад А, ворота 2</w:t>
+              <w:t>Адрес: 197374, Санкт-Петербург г., Приморский р-н, Торфяная дорога, д. 7 лит. Ф</w:t>
             </w:r>
           </w:p>
           <w:p>
@@ -1530,31 +1242,7 @@
                 <w:szCs w:val="16"/>
                 <w:lang w:val="ru-RU"/>
               </w:rPr>
-              <w:t xml:space="preserve">Контакт: </w:t>
-            </w:r>
-            <w:r>
-              <w:rPr>
-                <w:sz w:val="16"/>
-                <w:szCs w:val="16"/>
-                <w:lang w:val="ru-RU"/>
-              </w:rPr>
-              <w:t>Иван Примеров +7</w:t>
-            </w:r>
-            <w:r>
-              <w:rPr>
-                <w:sz w:val="16"/>
-                <w:szCs w:val="16"/>
-                <w:lang w:val="ru-RU"/>
-              </w:rPr>
-              <w:t xml:space="preserve"> </w:t>
-            </w:r>
-            <w:r>
-              <w:rPr>
-                <w:sz w:val="16"/>
-                <w:szCs w:val="16"/>
-                <w:lang w:val="ru-RU"/>
-              </w:rPr>
-              <w:t xml:space="preserve">000 000-00-03 </w:t>
+              <w:t xml:space="preserve">Контакт: Андрей / +7 951 680-89-52 </w:t>
             </w:r>
           </w:p>
           <w:p>
@@ -1605,12 +1293,17 @@
           <w:p>
             <w:pPr>
               <w:spacing w:before="80" w:after="60"/>
+              <w:rPr>
+                <w:sz w:val="14"/>
+                <w:szCs w:val="14"/>
+              </w:rPr>
             </w:pPr>
             <w:r>
               <w:rPr>
                 <w:b/>
                 <w:color w:val="B82832"/>
-                <w:sz w:val="16"/>
+                <w:sz w:val="14"/>
+                <w:szCs w:val="14"/>
               </w:rPr>
               <w:t xml:space="preserve">ВЫГРУЗКА </w:t>
             </w:r>
@@ -1618,7 +1311,8 @@
               <w:rPr>
                 <w:b/>
                 <w:color w:val="auto"/>
-                <w:sz w:val="16"/>
+                <w:sz w:val="14"/>
+                <w:szCs w:val="14"/>
               </w:rPr>
               <w:t>01</w:t>
             </w:r>
@@ -1626,19 +1320,27 @@
           <w:p>
             <w:pPr>
               <w:spacing w:after="40"/>
+              <w:rPr>
+                <w:sz w:val="16"/>
+                <w:szCs w:val="16"/>
+              </w:rPr>
             </w:pPr>
             <w:r>
               <w:rPr>
+                <w:b/>
+                <w:bCs/>
                 <w:sz w:val="16"/>
-              </w:rPr>
-              <w:t>07.10.2026</w:t>
+                <w:szCs w:val="16"/>
+              </w:rPr>
+              <w:t>15.10.2026</w:t>
             </w:r>
             <w:r>
               <w:rPr>
                 <w:sz w:val="16"/>
+                <w:szCs w:val="16"/>
               </w:rPr>
               <w:br/>
-              <w:t>09:00 – 11:00</w:t>
+              <w:t>09:00 12:00</w:t>
             </w:r>
           </w:p>
         </w:tc>
@@ -1687,17 +1389,7 @@
                 <w:szCs w:val="16"/>
                 <w:lang w:val="ru-RU"/>
               </w:rPr>
-              <w:t xml:space="preserve">ООО </w:t>
-            </w:r>
-            <w:r>
-              <w:rPr>
-                <w:b/>
-                <w:bCs/>
-                <w:sz w:val="16"/>
-                <w:szCs w:val="16"/>
-                <w:lang w:val="ru-RU"/>
-              </w:rPr>
-              <w:t>"НОВЫЙ ПРОЕКТ"</w:t>
+              <w:t>АНО "НЕВСКИЙ БАТАЛИСТ"</w:t>
             </w:r>
           </w:p>
           <w:p>
@@ -1714,7 +1406,15 @@
                 <w:szCs w:val="16"/>
                 <w:lang w:val="ru-RU"/>
               </w:rPr>
-              <w:t>Адрес: Санкт-Петербург, ул. Учебная, 12, склад А, ворота 2</w:t>
+              <w:t xml:space="preserve">Адрес: </w:t>
+            </w:r>
+            <w:r>
+              <w:rPr>
+                <w:sz w:val="16"/>
+                <w:szCs w:val="16"/>
+                <w:lang w:val="ru-RU"/>
+              </w:rPr>
+              <w:t>629306, Ямало-Ненецкий АО, Новый Уренгой г., Парковый мкр, д. 1</w:t>
             </w:r>
           </w:p>
           <w:p>
@@ -1731,15 +1431,7 @@
                 <w:szCs w:val="16"/>
                 <w:lang w:val="ru-RU"/>
               </w:rPr>
-              <w:t xml:space="preserve">Контакт: </w:t>
-            </w:r>
-            <w:r>
-              <w:rPr>
-                <w:sz w:val="16"/>
-                <w:szCs w:val="16"/>
-                <w:lang w:val="ru-RU"/>
-              </w:rPr>
-              <w:t xml:space="preserve">Иван Примеров +7 000 000-00-03 </w:t>
+              <w:t xml:space="preserve">Контакт: Андрей / +7 951 680-89-52 </w:t>
             </w:r>
           </w:p>
           <w:p>
@@ -1769,13 +1461,6 @@
         </w:tc>
       </w:tr>
     </w:tbl>
-    <w:p>
-      <w:pPr>
-        <w:rPr>
-          <w:lang w:val="ru-RU"/>
-        </w:rPr>
-      </w:pPr>
-    </w:p>
     <w:p>
       <w:pPr>
         <w:pBdr>
@@ -1783,6 +1468,8 @@
         </w:pBdr>
         <w:spacing w:before="220" w:after="120"/>
         <w:rPr>
+          <w:sz w:val="16"/>
+          <w:szCs w:val="16"/>
           <w:lang w:val="ru-RU"/>
         </w:rPr>
       </w:pPr>
@@ -1790,6 +1477,8 @@
         <w:rPr>
           <w:b/>
           <w:color w:val="B82832"/>
+          <w:sz w:val="16"/>
+          <w:szCs w:val="16"/>
         </w:rPr>
         <w:t>0</w:t>
       </w:r>
@@ -1797,6 +1486,8 @@
         <w:rPr>
           <w:b/>
           <w:color w:val="B82832"/>
+          <w:sz w:val="16"/>
+          <w:szCs w:val="16"/>
           <w:lang w:val="ru-RU"/>
         </w:rPr>
         <w:t>3</w:t>
@@ -1805,13 +1496,16 @@
         <w:rPr>
           <w:b/>
           <w:color w:val="B82832"/>
+          <w:sz w:val="16"/>
+          <w:szCs w:val="16"/>
         </w:rPr>
         <w:t xml:space="preserve"> </w:t>
       </w:r>
       <w:r>
         <w:rPr>
           <w:b/>
-          <w:sz w:val="20"/>
+          <w:sz w:val="16"/>
+          <w:szCs w:val="16"/>
           <w:lang w:val="ru-RU"/>
         </w:rPr>
         <w:t>ВОДИТЕЛЬ И ТРАНСПОРТ</w:t>
@@ -1851,17 +1545,24 @@
           <w:p>
             <w:pPr>
               <w:spacing w:after="0" w:line="20" w:lineRule="exact"/>
+              <w:rPr>
+                <w:lang w:val="ru-RU"/>
+              </w:rPr>
             </w:pPr>
           </w:p>
           <w:p>
             <w:pPr>
               <w:spacing w:after="60"/>
+              <w:rPr>
+                <w:lang w:val="ru-RU"/>
+              </w:rPr>
             </w:pPr>
             <w:r>
               <w:rPr>
                 <w:b/>
                 <w:color w:val="74777B"/>
                 <w:sz w:val="14"/>
+                <w:lang w:val="ru-RU"/>
               </w:rPr>
               <w:t>ВОДИТЕЛЬ</w:t>
             </w:r>
@@ -1869,28 +1570,19 @@
           <w:p>
             <w:pPr>
               <w:spacing w:after="100"/>
+              <w:rPr>
+                <w:sz w:val="16"/>
+                <w:szCs w:val="16"/>
+              </w:rPr>
             </w:pPr>
-            <w:proofErr w:type="spellStart"/>
-            <w:r>
-              <w:t>Сергей</w:t>
-            </w:r>
-            <w:proofErr w:type="spellEnd"/>
-            <w:r>
-              <w:t xml:space="preserve"> </w:t>
-            </w:r>
-            <w:proofErr w:type="spellStart"/>
-            <w:r>
-              <w:t>Викторович</w:t>
-            </w:r>
-            <w:proofErr w:type="spellEnd"/>
-            <w:r>
-              <w:t xml:space="preserve"> </w:t>
-            </w:r>
-            <w:proofErr w:type="spellStart"/>
-            <w:r>
-              <w:t>Образцов</w:t>
-            </w:r>
-            <w:proofErr w:type="spellEnd"/>
+            <w:r>
+              <w:rPr>
+                <w:sz w:val="16"/>
+                <w:szCs w:val="16"/>
+                <w:lang w:val="ru-RU"/>
+              </w:rPr>
+              <w:t>Пащенко Алексей Александрович</w:t>
+            </w:r>
           </w:p>
         </w:tc>
         <w:tc>
@@ -1909,6 +1601,9 @@
           <w:p>
             <w:pPr>
               <w:spacing w:after="0" w:line="20" w:lineRule="exact"/>
+              <w:rPr>
+                <w:lang w:val="ru-RU"/>
+              </w:rPr>
             </w:pPr>
           </w:p>
           <w:p>
@@ -1927,9 +1622,18 @@
           <w:p>
             <w:pPr>
               <w:spacing w:after="100"/>
+              <w:rPr>
+                <w:sz w:val="16"/>
+                <w:szCs w:val="16"/>
+              </w:rPr>
             </w:pPr>
             <w:r>
-              <w:t>+7 000 000-00-07</w:t>
+              <w:rPr>
+                <w:sz w:val="16"/>
+                <w:szCs w:val="16"/>
+                <w:lang w:val="ru-RU"/>
+              </w:rPr>
+              <w:t>+7 986 777-55-48</w:t>
             </w:r>
           </w:p>
         </w:tc>
@@ -1982,14 +1686,18 @@
             <w:pPr>
               <w:spacing w:after="100"/>
               <w:rPr>
+                <w:sz w:val="16"/>
+                <w:szCs w:val="16"/>
                 <w:lang w:val="ru-RU"/>
               </w:rPr>
             </w:pPr>
             <w:r>
               <w:rPr>
-                <w:lang w:val="ru-RU"/>
-              </w:rPr>
-              <w:t>0000 000000 УМВД РОССИИ ПО ОБЛ. 01.01.2026</w:t>
+                <w:sz w:val="16"/>
+                <w:szCs w:val="16"/>
+                <w:lang w:val="ru-RU"/>
+              </w:rPr>
+              <w:t>5305 238239 САРАКТАШСКИМ РОВД ОРЕНБУРГСКОЙ ОБЛ. 14.06.2006</w:t>
             </w:r>
           </w:p>
         </w:tc>
@@ -2035,14 +1743,18 @@
             <w:pPr>
               <w:spacing w:after="100"/>
               <w:rPr>
+                <w:sz w:val="16"/>
+                <w:szCs w:val="16"/>
                 <w:lang w:val="ru-RU"/>
               </w:rPr>
             </w:pPr>
             <w:r>
               <w:rPr>
-                <w:lang w:val="ru-RU"/>
-              </w:rPr>
-              <w:t>00 00 000000 01.01.2020 – 01.01.2030</w:t>
+                <w:sz w:val="16"/>
+                <w:szCs w:val="16"/>
+                <w:lang w:val="ru-RU"/>
+              </w:rPr>
+              <w:t>99 20 282557 03.11.2020 - 03.11.2030</w:t>
             </w:r>
           </w:p>
         </w:tc>
@@ -2069,17 +1781,24 @@
           <w:p>
             <w:pPr>
               <w:spacing w:after="0" w:line="20" w:lineRule="exact"/>
+              <w:rPr>
+                <w:lang w:val="ru-RU"/>
+              </w:rPr>
             </w:pPr>
           </w:p>
           <w:p>
             <w:pPr>
               <w:spacing w:after="60"/>
+              <w:rPr>
+                <w:lang w:val="ru-RU"/>
+              </w:rPr>
             </w:pPr>
             <w:r>
               <w:rPr>
                 <w:b/>
                 <w:color w:val="74777B"/>
                 <w:sz w:val="14"/>
+                <w:lang w:val="ru-RU"/>
               </w:rPr>
               <w:t>ТЯГАЧ / АВТОМОБИЛЬ</w:t>
             </w:r>
@@ -2087,9 +1806,26 @@
           <w:p>
             <w:pPr>
               <w:spacing w:after="100"/>
+              <w:rPr>
+                <w:sz w:val="16"/>
+                <w:szCs w:val="16"/>
+                <w:lang w:val="ru-RU"/>
+              </w:rPr>
             </w:pPr>
             <w:r>
-              <w:t>Volvo FH 460</w:t>
+              <w:rPr>
+                <w:sz w:val="16"/>
+                <w:szCs w:val="16"/>
+                <w:lang w:val="ru-RU"/>
+              </w:rPr>
+              <w:t xml:space="preserve">Седельный тягач, </w:t>
+            </w:r>
+            <w:r>
+              <w:rPr>
+                <w:sz w:val="16"/>
+                <w:szCs w:val="16"/>
+              </w:rPr>
+              <w:t>DONGFENG</w:t>
             </w:r>
           </w:p>
         </w:tc>
@@ -2109,6 +1845,9 @@
           <w:p>
             <w:pPr>
               <w:spacing w:after="0" w:line="20" w:lineRule="exact"/>
+              <w:rPr>
+                <w:lang w:val="ru-RU"/>
+              </w:rPr>
             </w:pPr>
           </w:p>
           <w:p>
@@ -2127,9 +1866,62 @@
           <w:p>
             <w:pPr>
               <w:spacing w:after="100"/>
+              <w:rPr>
+                <w:sz w:val="16"/>
+                <w:szCs w:val="16"/>
+              </w:rPr>
             </w:pPr>
             <w:r>
-              <w:t>А000АА 00</w:t>
+              <w:rPr>
+                <w:sz w:val="16"/>
+                <w:szCs w:val="16"/>
+              </w:rPr>
+              <w:t>К</w:t>
+            </w:r>
+            <w:r>
+              <w:rPr>
+                <w:sz w:val="16"/>
+                <w:szCs w:val="16"/>
+                <w:lang w:val="ru-RU"/>
+              </w:rPr>
+              <w:t xml:space="preserve"> </w:t>
+            </w:r>
+            <w:r>
+              <w:rPr>
+                <w:sz w:val="16"/>
+                <w:szCs w:val="16"/>
+              </w:rPr>
+              <w:t>610</w:t>
+            </w:r>
+            <w:r>
+              <w:rPr>
+                <w:sz w:val="16"/>
+                <w:szCs w:val="16"/>
+                <w:lang w:val="ru-RU"/>
+              </w:rPr>
+              <w:t xml:space="preserve"> </w:t>
+            </w:r>
+            <w:r>
+              <w:rPr>
+                <w:sz w:val="16"/>
+                <w:szCs w:val="16"/>
+              </w:rPr>
+              <w:t>МТ</w:t>
+            </w:r>
+            <w:r>
+              <w:rPr>
+                <w:sz w:val="16"/>
+                <w:szCs w:val="16"/>
+                <w:lang w:val="ru-RU"/>
+              </w:rPr>
+              <w:t xml:space="preserve"> </w:t>
+            </w:r>
+            <w:r>
+              <w:rPr>
+                <w:sz w:val="16"/>
+                <w:szCs w:val="16"/>
+              </w:rPr>
+              <w:t>156</w:t>
             </w:r>
           </w:p>
         </w:tc>
@@ -2178,11 +1970,16 @@
             <w:pPr>
               <w:spacing w:after="60"/>
               <w:rPr>
-                <w:lang w:val="ru-RU"/>
+                <w:sz w:val="16"/>
+                <w:szCs w:val="16"/>
               </w:rPr>
             </w:pPr>
             <w:r>
-              <w:t>Schmitz</w:t>
+              <w:rPr>
+                <w:sz w:val="16"/>
+                <w:szCs w:val="16"/>
+              </w:rPr>
+              <w:t>BONUM</w:t>
             </w:r>
           </w:p>
         </w:tc>
@@ -2214,11 +2011,15 @@
             <w:pPr>
               <w:spacing w:after="100"/>
               <w:rPr>
+                <w:sz w:val="16"/>
+                <w:szCs w:val="16"/>
                 <w:lang w:val="ru-RU"/>
               </w:rPr>
             </w:pPr>
             <w:r>
               <w:rPr>
+                <w:sz w:val="16"/>
+                <w:szCs w:val="16"/>
                 <w:lang w:val="ru-RU"/>
               </w:rPr>
               <w:t>Тентованный</w:t>
@@ -2259,9 +2060,18 @@
           <w:p>
             <w:pPr>
               <w:spacing w:after="100"/>
+              <w:rPr>
+                <w:sz w:val="16"/>
+                <w:szCs w:val="16"/>
+              </w:rPr>
             </w:pPr>
             <w:r>
-              <w:t>АА0000 00</w:t>
+              <w:rPr>
+                <w:sz w:val="16"/>
+                <w:szCs w:val="16"/>
+                <w:lang w:val="ru-RU"/>
+              </w:rPr>
+              <w:t>ВЕ 5985 56</w:t>
             </w:r>
           </w:p>
         </w:tc>
@@ -2274,6 +2084,8 @@
         </w:pBdr>
         <w:spacing w:before="220" w:after="120"/>
         <w:rPr>
+          <w:sz w:val="16"/>
+          <w:szCs w:val="16"/>
           <w:lang w:val="ru-RU"/>
         </w:rPr>
       </w:pPr>
@@ -2281,13 +2093,16 @@
         <w:rPr>
           <w:b/>
           <w:color w:val="B82832"/>
+          <w:sz w:val="16"/>
+          <w:szCs w:val="16"/>
         </w:rPr>
         <w:t xml:space="preserve">04 </w:t>
       </w:r>
       <w:r>
         <w:rPr>
           <w:b/>
-          <w:sz w:val="20"/>
+          <w:sz w:val="16"/>
+          <w:szCs w:val="16"/>
         </w:rPr>
         <w:t>ОСНОВНЫЕ УСЛОВИЯ</w:t>
       </w:r>
@@ -2353,7 +2168,6 @@
           <w:sz w:val="16"/>
           <w:lang w:val="ru-RU"/>
         </w:rPr>
-        <w:lastRenderedPageBreak/>
         <w:t>Стороны несут ответственность за неисполнение либо ненадлежащее исполнение взятых на себя обязательств по настоящей заявке в соответствии с условиями договора и законодательства РФ.</w:t>
       </w:r>
     </w:p>
@@ -2370,7 +2184,7 @@
           <w:sz w:val="16"/>
           <w:lang w:val="ru-RU"/>
         </w:rPr>
-        <w:t>В случае задержки подачи транспортного средства к месту погрузки, указанному в договоре-заявке более чем на 8 часов, Перевозчик выплачивает штраф Заказчику в размере 1500 руб. в сутки (24 часа).</w:t>
+        <w:t>В случае задержки подачи транспортного средства к месту погрузки, указанному в договоре-заявке более чем на 8 часов, Перевозчик выплачивает штраф Заказчику в размере 1500 руб. в сутки (не указано часа).</w:t>
       </w:r>
     </w:p>
     <w:p>
@@ -2386,6 +2200,7 @@
           <w:sz w:val="16"/>
           <w:lang w:val="ru-RU"/>
         </w:rPr>
+        <w:lastRenderedPageBreak/>
         <w:t>Информировать Заказчика заблаговременно о невозможности прихода транспорта в назначенное время и место погрузки, о задержке в пути следования к месту погрузки.</w:t>
       </w:r>
     </w:p>
@@ -2463,25 +2278,33 @@
           <w:bottom w:val="single" w:sz="4" w:space="6" w:color="D0D2D4"/>
         </w:pBdr>
         <w:spacing w:before="220" w:after="120"/>
+        <w:rPr>
+          <w:sz w:val="16"/>
+          <w:szCs w:val="16"/>
+        </w:rPr>
       </w:pPr>
       <w:r>
         <w:rPr>
           <w:b/>
           <w:color w:val="B82832"/>
+          <w:sz w:val="16"/>
+          <w:szCs w:val="16"/>
         </w:rPr>
         <w:t xml:space="preserve">05 </w:t>
       </w:r>
       <w:r>
         <w:rPr>
           <w:b/>
-          <w:sz w:val="20"/>
+          <w:sz w:val="16"/>
+          <w:szCs w:val="16"/>
         </w:rPr>
         <w:t>РАСЧ</w:t>
       </w:r>
       <w:r>
         <w:rPr>
           <w:b/>
-          <w:sz w:val="20"/>
+          <w:sz w:val="16"/>
+          <w:szCs w:val="16"/>
           <w:lang w:val="ru-RU"/>
         </w:rPr>
         <w:t>Е</w:t>
@@ -2489,7 +2312,8 @@
       <w:r>
         <w:rPr>
           <w:b/>
-          <w:sz w:val="20"/>
+          <w:sz w:val="16"/>
+          <w:szCs w:val="16"/>
         </w:rPr>
         <w:t>ТЫ</w:t>
       </w:r>
@@ -2550,20 +2374,18 @@
             <w:pPr>
               <w:spacing w:after="100"/>
               <w:rPr>
+                <w:sz w:val="16"/>
+                <w:szCs w:val="16"/>
                 <w:lang w:val="ru-RU"/>
               </w:rPr>
             </w:pPr>
             <w:r>
               <w:rPr>
-                <w:lang w:val="ru-RU"/>
-              </w:rPr>
-              <w:t>Безналич</w:t>
-            </w:r>
-            <w:r>
-              <w:rPr>
-                <w:lang w:val="ru-RU"/>
-              </w:rPr>
-              <w:t>ный расчет, НДС 22%</w:t>
+                <w:sz w:val="16"/>
+                <w:szCs w:val="16"/>
+                <w:lang w:val="ru-RU"/>
+              </w:rPr>
+              <w:t>Безналичный расчет, НДС 22%</w:t>
             </w:r>
           </w:p>
           <w:p>
@@ -2587,14 +2409,34 @@
             <w:pPr>
               <w:spacing w:after="100"/>
               <w:rPr>
+                <w:sz w:val="16"/>
+                <w:szCs w:val="16"/>
                 <w:lang w:val="ru-RU"/>
               </w:rPr>
             </w:pPr>
             <w:r>
               <w:rPr>
-                <w:lang w:val="ru-RU"/>
-              </w:rPr>
-              <w:t>10 банковских дней</w:t>
+                <w:sz w:val="16"/>
+                <w:szCs w:val="16"/>
+                <w:lang w:val="ru-RU"/>
+              </w:rPr>
+              <w:t>10</w:t>
+            </w:r>
+            <w:r>
+              <w:rPr>
+                <w:sz w:val="16"/>
+                <w:szCs w:val="16"/>
+                <w:lang w:val="ru-RU"/>
+              </w:rPr>
+              <w:t xml:space="preserve"> (десять)</w:t>
+            </w:r>
+            <w:r>
+              <w:rPr>
+                <w:sz w:val="16"/>
+                <w:szCs w:val="16"/>
+                <w:lang w:val="ru-RU"/>
+              </w:rPr>
+              <w:t xml:space="preserve"> банковских дней</w:t>
             </w:r>
           </w:p>
           <w:p>
@@ -2611,44 +2453,58 @@
                 <w:sz w:val="14"/>
                 <w:lang w:val="ru-RU"/>
               </w:rPr>
-              <w:t>ОТСЧЁТ СРОКА ОПЛАТЫ</w:t>
+              <w:t>ОТСЧ</w:t>
+            </w:r>
+            <w:r>
+              <w:rPr>
+                <w:b/>
+                <w:color w:val="74777B"/>
+                <w:sz w:val="14"/>
+                <w:lang w:val="ru-RU"/>
+              </w:rPr>
+              <w:t>Е</w:t>
+            </w:r>
+            <w:r>
+              <w:rPr>
+                <w:b/>
+                <w:color w:val="74777B"/>
+                <w:sz w:val="14"/>
+                <w:lang w:val="ru-RU"/>
+              </w:rPr>
+              <w:t>Т СРОКА ОПЛАТЫ</w:t>
             </w:r>
           </w:p>
           <w:p>
             <w:pPr>
               <w:spacing w:after="100"/>
               <w:rPr>
+                <w:sz w:val="16"/>
+                <w:szCs w:val="16"/>
                 <w:lang w:val="ru-RU"/>
               </w:rPr>
             </w:pPr>
             <w:r>
               <w:rPr>
-                <w:lang w:val="ru-RU"/>
-              </w:rPr>
-              <w:t xml:space="preserve">После получения оригиналов ТН, УПД и </w:t>
-            </w:r>
-            <w:r>
-              <w:rPr>
-                <w:lang w:val="ru-RU"/>
-              </w:rPr>
-              <w:t>счета</w:t>
-            </w:r>
-          </w:p>
-          <w:p>
-            <w:pPr>
-              <w:spacing w:after="100"/>
-              <w:rPr>
-                <w:lang w:val="ru-RU"/>
-              </w:rPr>
-            </w:pPr>
+                <w:sz w:val="16"/>
+                <w:szCs w:val="16"/>
+                <w:lang w:val="ru-RU"/>
+              </w:rPr>
+              <w:t>После получения оригиналов ТН, УПД и счета</w:t>
+            </w:r>
+            <w:r>
+              <w:rPr>
+                <w:rFonts w:ascii="Cambria Math" w:hAnsi="Cambria Math" w:cs="Cambria Math"/>
+                <w:sz w:val="16"/>
+                <w:szCs w:val="16"/>
+                <w:lang w:val="ru-RU"/>
+              </w:rPr>
+              <w:t xml:space="preserve"> </w:t>
+            </w:r>
           </w:p>
         </w:tc>
         <w:tc>
           <w:tcPr>
             <w:tcW w:w="2466" w:type="dxa"/>
-            <w:tcBorders>
-              <w:top w:val="single" w:sz="6" w:space="0" w:color="27292C"/>
-            </w:tcBorders>
             <w:tcMar>
               <w:top w:w="65" w:type="dxa"/>
               <w:left w:w="75" w:type="dxa"/>
@@ -2684,6 +2540,7 @@
           <w:p>
             <w:pPr>
               <w:spacing w:after="180"/>
+              <w:jc w:val="right"/>
               <w:rPr>
                 <w:lang w:val="ru-RU"/>
               </w:rPr>
@@ -2693,23 +2550,33 @@
                 <w:sz w:val="20"/>
                 <w:lang w:val="ru-RU"/>
               </w:rPr>
-              <w:t>Ставка</w:t>
+              <w:t>Стоимость</w:t>
             </w:r>
           </w:p>
           <w:p>
             <w:pPr>
-              <w:rPr>
+              <w:pBdr>
+                <w:bottom w:val="single" w:sz="12" w:space="1" w:color="auto"/>
+              </w:pBdr>
+              <w:jc w:val="right"/>
+              <w:rPr>
+                <w:sz w:val="20"/>
+                <w:szCs w:val="20"/>
                 <w:lang w:val="ru-RU"/>
               </w:rPr>
             </w:pPr>
             <w:r>
               <w:rPr>
+                <w:sz w:val="20"/>
+                <w:szCs w:val="20"/>
                 <w:lang w:val="ru-RU"/>
               </w:rPr>
               <w:t>В том числе НДС</w:t>
             </w:r>
             <w:r>
               <w:rPr>
+                <w:sz w:val="20"/>
+                <w:szCs w:val="20"/>
                 <w:lang w:val="ru-RU"/>
               </w:rPr>
               <w:t xml:space="preserve"> 22%</w:t>
@@ -2717,6 +2584,14 @@
           </w:p>
           <w:p>
             <w:pPr>
+              <w:rPr>
+                <w:lang w:val="ru-RU"/>
+              </w:rPr>
+            </w:pPr>
+          </w:p>
+          <w:p>
+            <w:pPr>
+              <w:jc w:val="right"/>
               <w:rPr>
                 <w:lang w:val="ru-RU"/>
               </w:rPr>
@@ -2744,9 +2619,6 @@
         <w:tc>
           <w:tcPr>
             <w:tcW w:w="2466" w:type="dxa"/>
-            <w:tcBorders>
-              <w:top w:val="single" w:sz="6" w:space="0" w:color="27292C"/>
-            </w:tcBorders>
           </w:tcPr>
           <w:p>
             <w:pPr>
@@ -2779,42 +2651,89 @@
               <w:spacing w:after="180"/>
               <w:jc w:val="right"/>
               <w:rPr>
+                <w:rFonts w:cs="Arial"/>
+                <w:sz w:val="20"/>
+                <w:szCs w:val="20"/>
                 <w:lang w:val="ru-RU"/>
               </w:rPr>
             </w:pPr>
             <w:r>
               <w:rPr>
                 <w:sz w:val="20"/>
-                <w:lang w:val="ru-RU"/>
-              </w:rPr>
-              <w:t>75 000,00</w:t>
+                <w:szCs w:val="20"/>
+              </w:rPr>
+              <w:t>650</w:t>
+            </w:r>
+            <w:r>
+              <w:rPr>
+                <w:sz w:val="20"/>
+                <w:szCs w:val="20"/>
+                <w:lang w:val="ru-RU"/>
+              </w:rPr>
+              <w:t> </w:t>
+            </w:r>
+            <w:r>
+              <w:rPr>
+                <w:rFonts w:cs="Arial"/>
+                <w:sz w:val="20"/>
+                <w:szCs w:val="20"/>
+                <w:lang w:val="ru-RU"/>
+              </w:rPr>
+              <w:t>000,00</w:t>
+            </w:r>
+            <w:r>
+              <w:rPr>
+                <w:rFonts w:cs="Arial"/>
+                <w:sz w:val="20"/>
+                <w:szCs w:val="20"/>
+              </w:rPr>
+              <w:t xml:space="preserve"> </w:t>
+            </w:r>
+            <w:r>
+              <w:rPr>
+                <w:rFonts w:ascii="Cambria Math" w:hAnsi="Cambria Math" w:cs="Cambria Math"/>
+                <w:sz w:val="20"/>
+                <w:szCs w:val="20"/>
+                <w:lang w:val="ru-RU"/>
+              </w:rPr>
+              <w:t>₽</w:t>
+            </w:r>
+          </w:p>
+          <w:p>
+            <w:pPr>
+              <w:pBdr>
+                <w:bottom w:val="single" w:sz="12" w:space="1" w:color="auto"/>
+              </w:pBdr>
+              <w:jc w:val="right"/>
+              <w:rPr>
+                <w:rFonts w:cs="Arial"/>
+                <w:sz w:val="20"/>
+                <w:szCs w:val="20"/>
+              </w:rPr>
+            </w:pPr>
+            <w:r>
+              <w:rPr>
+                <w:rFonts w:cs="Arial"/>
+                <w:sz w:val="20"/>
+                <w:szCs w:val="20"/>
+                <w:lang w:val="ru-RU"/>
+              </w:rPr>
+              <w:t xml:space="preserve">117 213,11 </w:t>
+            </w:r>
+            <w:r>
+              <w:rPr>
+                <w:rFonts w:ascii="Cambria Math" w:hAnsi="Cambria Math" w:cs="Cambria Math"/>
+                <w:sz w:val="20"/>
+                <w:szCs w:val="20"/>
+                <w:lang w:val="ru-RU"/>
+              </w:rPr>
+              <w:t>₽</w:t>
             </w:r>
           </w:p>
           <w:p>
             <w:pPr>
               <w:jc w:val="right"/>
-              <w:rPr>
-                <w:lang w:val="ru-RU"/>
-              </w:rPr>
             </w:pPr>
-            <w:r>
-              <w:rPr>
-                <w:lang w:val="ru-RU"/>
-              </w:rPr>
-              <w:t>13 524</w:t>
-            </w:r>
-            <w:r>
-              <w:rPr>
-                <w:lang w:val="ru-RU"/>
-              </w:rPr>
-              <w:t>,</w:t>
-            </w:r>
-            <w:r>
-              <w:rPr>
-                <w:lang w:val="ru-RU"/>
-              </w:rPr>
-              <w:t xml:space="preserve">59 </w:t>
-            </w:r>
           </w:p>
           <w:p>
             <w:pPr>
@@ -2822,7 +2741,6 @@
               <w:jc w:val="right"/>
               <w:rPr>
                 <w:sz w:val="20"/>
-                <w:lang w:val="ru-RU"/>
               </w:rPr>
             </w:pPr>
             <w:r>
@@ -2832,30 +2750,251 @@
                 <w:sz w:val="36"/>
                 <w:lang w:val="ru-RU"/>
               </w:rPr>
-              <w:t>75 000,00</w:t>
-            </w:r>
+              <w:t>650</w:t>
+            </w:r>
+            <w:r>
+              <w:rPr>
+                <w:b/>
+                <w:color w:val="B82832"/>
+                <w:sz w:val="36"/>
+                <w:lang w:val="ru-RU"/>
+              </w:rPr>
+              <w:t> 000,00</w:t>
+            </w:r>
+            <w:r>
+              <w:rPr>
+                <w:rFonts w:cs="Arial"/>
+                <w:b/>
+                <w:color w:val="B82832"/>
+                <w:sz w:val="36"/>
+              </w:rPr>
+              <w:t xml:space="preserve"> </w:t>
+            </w:r>
+            <w:r>
+              <w:rPr>
+                <w:rFonts w:ascii="Cambria Math" w:hAnsi="Cambria Math" w:cs="Cambria Math"/>
+                <w:b/>
+                <w:color w:val="B82832"/>
+                <w:sz w:val="36"/>
+              </w:rPr>
+              <w:t>₽</w:t>
+            </w:r>
+          </w:p>
+        </w:tc>
+      </w:tr>
+      <w:tr>
+        <w:trPr>
+          <w:cantSplit/>
+          <w:jc w:val="center"/>
+        </w:trPr>
+        <w:tc>
+          <w:tcPr>
+            <w:tcW w:w="9864" w:type="dxa"/>
+            <w:gridSpan w:val="3"/>
+            <w:tcMar>
+              <w:top w:w="65" w:type="dxa"/>
+              <w:left w:w="75" w:type="dxa"/>
+              <w:bottom w:w="65" w:type="dxa"/>
+              <w:right w:w="75" w:type="dxa"/>
+            </w:tcMar>
+          </w:tcPr>
+          <w:p>
+            <w:pPr>
+              <w:spacing w:after="0" w:line="20" w:lineRule="exact"/>
+              <w:rPr>
+                <w:lang w:val="ru-RU"/>
+              </w:rPr>
+            </w:pPr>
+          </w:p>
+          <w:p>
+            <w:pPr>
+              <w:spacing w:after="60"/>
+              <w:rPr>
+                <w:lang w:val="ru-RU"/>
+              </w:rPr>
+            </w:pPr>
+            <w:r>
+              <w:rPr>
+                <w:b/>
+                <w:color w:val="74777B"/>
+                <w:sz w:val="14"/>
+                <w:lang w:val="ru-RU"/>
+              </w:rPr>
+              <w:t>ДОПОЛНИТЕЛЬНЫЕ УСЛОВИЯ</w:t>
+            </w:r>
+            <w:r>
+              <w:rPr>
+                <w:b/>
+                <w:color w:val="74777B"/>
+                <w:sz w:val="14"/>
+                <w:lang w:val="ru-RU"/>
+              </w:rPr>
+              <w:t xml:space="preserve"> ОПЛАТЫ</w:t>
+            </w:r>
+          </w:p>
+          <w:p>
+            <w:pPr>
+              <w:spacing w:after="100"/>
+              <w:rPr>
+                <w:color w:val="FFFFFF" w:themeColor="background1"/>
+                <w:lang w:val="ru-RU"/>
+              </w:rPr>
+            </w:pPr>
+            <w:r>
+              <w:rPr>
+                <w:sz w:val="16"/>
+                <w:szCs w:val="16"/>
+                <w:lang w:val="ru-RU"/>
+              </w:rPr>
+              <w:t xml:space="preserve">Предоплата 400 000,00 </w:t>
+            </w:r>
+            <w:r>
+              <w:rPr>
+                <w:rFonts w:ascii="Cambria Math" w:hAnsi="Cambria Math" w:cs="Cambria Math"/>
+                <w:sz w:val="16"/>
+                <w:szCs w:val="16"/>
+                <w:lang w:val="ru-RU"/>
+              </w:rPr>
+              <w:t>₽</w:t>
+            </w:r>
+            <w:r>
+              <w:rPr>
+                <w:sz w:val="16"/>
+                <w:szCs w:val="16"/>
+                <w:lang w:val="ru-RU"/>
+              </w:rPr>
+              <w:t xml:space="preserve"> по факту погрузки в течение 3</w:t>
+            </w:r>
+            <w:r>
+              <w:rPr>
+                <w:sz w:val="16"/>
+                <w:szCs w:val="16"/>
+                <w:lang w:val="ru-RU"/>
+              </w:rPr>
+              <w:t xml:space="preserve"> (трех)</w:t>
+            </w:r>
+            <w:r>
+              <w:rPr>
+                <w:sz w:val="16"/>
+                <w:szCs w:val="16"/>
+                <w:lang w:val="ru-RU"/>
+              </w:rPr>
+              <w:t xml:space="preserve"> банковских дней.</w:t>
+            </w:r>
+            <w:r>
+              <w:rPr>
+                <w:rFonts w:ascii="Cambria Math" w:hAnsi="Cambria Math" w:cs="Cambria Math"/>
+                <w:lang w:val="ru-RU"/>
+              </w:rPr>
+              <w:t xml:space="preserve"> </w:t>
+            </w:r>
+          </w:p>
+        </w:tc>
+      </w:tr>
+      <w:tr>
+        <w:trPr>
+          <w:cantSplit/>
+          <w:jc w:val="center"/>
+        </w:trPr>
+        <w:tc>
+          <w:tcPr>
+            <w:tcW w:w="4932" w:type="dxa"/>
+            <w:tcMar>
+              <w:top w:w="65" w:type="dxa"/>
+              <w:left w:w="75" w:type="dxa"/>
+              <w:bottom w:w="65" w:type="dxa"/>
+              <w:right w:w="75" w:type="dxa"/>
+            </w:tcMar>
+          </w:tcPr>
+          <w:p>
+            <w:pPr>
+              <w:spacing w:after="0" w:line="20" w:lineRule="exact"/>
+              <w:rPr>
+                <w:lang w:val="ru-RU"/>
+              </w:rPr>
+            </w:pPr>
+          </w:p>
+        </w:tc>
+        <w:tc>
+          <w:tcPr>
+            <w:tcW w:w="2466" w:type="dxa"/>
+            <w:tcMar>
+              <w:top w:w="65" w:type="dxa"/>
+              <w:left w:w="75" w:type="dxa"/>
+              <w:bottom w:w="65" w:type="dxa"/>
+              <w:right w:w="75" w:type="dxa"/>
+            </w:tcMar>
+          </w:tcPr>
+          <w:p>
+            <w:pPr>
+              <w:spacing w:after="0" w:line="20" w:lineRule="exact"/>
+              <w:rPr>
+                <w:lang w:val="ru-RU"/>
+              </w:rPr>
+            </w:pPr>
+          </w:p>
+        </w:tc>
+        <w:tc>
+          <w:tcPr>
+            <w:tcW w:w="2466" w:type="dxa"/>
+          </w:tcPr>
+          <w:p>
+            <w:pPr>
+              <w:spacing w:after="0" w:line="20" w:lineRule="exact"/>
+              <w:rPr>
+                <w:lang w:val="ru-RU"/>
+              </w:rPr>
+            </w:pPr>
           </w:p>
         </w:tc>
       </w:tr>
     </w:tbl>
     <w:p>
       <w:pPr>
-        <w:spacing w:before="240" w:after="160"/>
+        <w:pBdr>
+          <w:bottom w:val="single" w:sz="4" w:space="6" w:color="D0D2D4"/>
+        </w:pBdr>
+        <w:spacing w:before="220" w:after="120"/>
         <w:rPr>
+          <w:sz w:val="16"/>
+          <w:szCs w:val="16"/>
           <w:lang w:val="ru-RU"/>
         </w:rPr>
       </w:pPr>
       <w:r>
         <w:rPr>
           <w:b/>
-          <w:color w:val="BA0100"/>
-          <w:lang w:val="ru-RU"/>
+          <w:color w:val="B82832"/>
+          <w:sz w:val="16"/>
+          <w:szCs w:val="16"/>
         </w:rPr>
-        <w:t xml:space="preserve">06 </w:t>
+        <w:t>0</w:t>
       </w:r>
       <w:r>
         <w:rPr>
           <w:b/>
+          <w:color w:val="B82832"/>
+          <w:sz w:val="16"/>
+          <w:szCs w:val="16"/>
+          <w:lang w:val="ru-RU"/>
+        </w:rPr>
+        <w:t>6</w:t>
+      </w:r>
+      <w:r>
+        <w:rPr>
+          <w:b/>
+          <w:color w:val="B82832"/>
+          <w:sz w:val="16"/>
+          <w:szCs w:val="16"/>
+        </w:rPr>
+        <w:t xml:space="preserve"> </w:t>
+      </w:r>
+      <w:r>
+        <w:rPr>
+          <w:b/>
+          <w:sz w:val="16"/>
+          <w:szCs w:val="16"/>
+          <w:lang w:val="ru-RU"/>
         </w:rPr>
         <w:t>ПОДПИСИ СТОРОН</w:t>
       </w:r>
@@ -2879,9 +3018,6 @@
         <w:tc>
           <w:tcPr>
             <w:tcW w:w="4932" w:type="dxa"/>
-            <w:tcBorders>
-              <w:top w:val="single" w:sz="4" w:space="0" w:color="27292C"/>
-            </w:tcBorders>
             <w:tcMar>
               <w:top w:w="65" w:type="dxa"/>
               <w:left w:w="75" w:type="dxa"/>
@@ -2917,29 +3053,39 @@
             <w:pPr>
               <w:spacing w:after="120"/>
               <w:rPr>
+                <w:sz w:val="20"/>
+                <w:szCs w:val="20"/>
                 <w:lang w:val="ru-RU"/>
               </w:rPr>
             </w:pPr>
             <w:r>
               <w:rPr>
+                <w:sz w:val="20"/>
+                <w:szCs w:val="20"/>
                 <w:lang w:val="ru-RU"/>
               </w:rPr>
               <w:t xml:space="preserve">ООО </w:t>
             </w:r>
             <w:r>
               <w:rPr>
+                <w:sz w:val="20"/>
+                <w:szCs w:val="20"/>
                 <w:lang w:val="ru-RU"/>
               </w:rPr>
               <w:t>"</w:t>
             </w:r>
             <w:r>
               <w:rPr>
+                <w:sz w:val="20"/>
+                <w:szCs w:val="20"/>
                 <w:lang w:val="ru-RU"/>
               </w:rPr>
               <w:t>НОВЫЙ ПРОЕКТ</w:t>
             </w:r>
             <w:r>
               <w:rPr>
+                <w:sz w:val="20"/>
+                <w:szCs w:val="20"/>
                 <w:lang w:val="ru-RU"/>
               </w:rPr>
               <w:t>"</w:t>
@@ -2978,17 +3124,8 @@
                 <w:sz w:val="16"/>
                 <w:lang w:val="ru-RU"/>
               </w:rPr>
-              <w:t xml:space="preserve">Мищенко </w:t>
-            </w:r>
-            <w:proofErr w:type="gramStart"/>
-            <w:r>
-              <w:rPr>
-                <w:sz w:val="16"/>
-                <w:lang w:val="ru-RU"/>
-              </w:rPr>
-              <w:t>Д.В.</w:t>
-            </w:r>
-            <w:proofErr w:type="gramEnd"/>
+              <w:t>Мищенко Д.В.</w:t>
+            </w:r>
           </w:p>
           <w:p>
             <w:pPr>
@@ -3003,16 +3140,29 @@
                 <w:sz w:val="14"/>
                 <w:lang w:val="ru-RU"/>
               </w:rPr>
-              <w:t>Подпись                          Расшифровка</w:t>
+              <w:t>Подпись</w:t>
+            </w:r>
+            <w:r>
+              <w:rPr>
+                <w:color w:val="74777B"/>
+                <w:sz w:val="14"/>
+                <w:lang w:val="ru-RU"/>
+              </w:rPr>
+              <w:t xml:space="preserve">      М.П.</w:t>
+            </w:r>
+            <w:r>
+              <w:rPr>
+                <w:color w:val="74777B"/>
+                <w:sz w:val="14"/>
+                <w:lang w:val="ru-RU"/>
+              </w:rPr>
+              <w:t xml:space="preserve">            Расшифровка</w:t>
             </w:r>
           </w:p>
         </w:tc>
         <w:tc>
           <w:tcPr>
             <w:tcW w:w="4932" w:type="dxa"/>
-            <w:tcBorders>
-              <w:top w:val="single" w:sz="4" w:space="0" w:color="27292C"/>
-            </w:tcBorders>
             <w:tcMar>
               <w:top w:w="65" w:type="dxa"/>
               <w:left w:w="75" w:type="dxa"/>
@@ -3048,36 +3198,27 @@
             <w:pPr>
               <w:spacing w:after="120"/>
               <w:rPr>
+                <w:sz w:val="20"/>
+                <w:szCs w:val="20"/>
                 <w:lang w:val="ru-RU"/>
               </w:rPr>
             </w:pPr>
             <w:r>
               <w:rPr>
-                <w:lang w:val="ru-RU"/>
-              </w:rPr>
-              <w:t xml:space="preserve">ООО </w:t>
-            </w:r>
-            <w:r>
-              <w:rPr>
-                <w:lang w:val="ru-RU"/>
-              </w:rPr>
-              <w:t>"ДЕМО ТРАНС"</w:t>
+                <w:sz w:val="20"/>
+                <w:szCs w:val="20"/>
+                <w:lang w:val="ru-RU"/>
+              </w:rPr>
+              <w:t>ИП Никиточкина Ольга Сергеевна</w:t>
             </w:r>
           </w:p>
           <w:p>
             <w:pPr>
-              <w:spacing w:after="200"/>
-              <w:rPr>
+              <w:rPr>
+                <w:sz w:val="16"/>
                 <w:lang w:val="ru-RU"/>
               </w:rPr>
             </w:pPr>
-            <w:r>
-              <w:rPr>
-                <w:sz w:val="16"/>
-                <w:lang w:val="ru-RU"/>
-              </w:rPr>
-              <w:t>Директор</w:t>
-            </w:r>
           </w:p>
           <w:p>
             <w:pPr>
@@ -3090,24 +3231,36 @@
                 <w:sz w:val="16"/>
                 <w:lang w:val="ru-RU"/>
               </w:rPr>
-              <w:t>________________ / Демин</w:t>
+              <w:t xml:space="preserve">________________ / </w:t>
             </w:r>
             <w:r>
               <w:rPr>
                 <w:sz w:val="16"/>
                 <w:lang w:val="ru-RU"/>
               </w:rPr>
-              <w:t xml:space="preserve"> </w:t>
-            </w:r>
-            <w:proofErr w:type="gramStart"/>
+              <w:t>Никиточкина</w:t>
+            </w:r>
             <w:r>
               <w:rPr>
                 <w:sz w:val="16"/>
                 <w:lang w:val="ru-RU"/>
               </w:rPr>
-              <w:t>О.А.</w:t>
-            </w:r>
-            <w:proofErr w:type="gramEnd"/>
+              <w:t xml:space="preserve"> О.</w:t>
+            </w:r>
+            <w:r>
+              <w:rPr>
+                <w:sz w:val="16"/>
+                <w:lang w:val="ru-RU"/>
+              </w:rPr>
+              <w:t>С</w:t>
+            </w:r>
+            <w:r>
+              <w:rPr>
+                <w:sz w:val="16"/>
+                <w:lang w:val="ru-RU"/>
+              </w:rPr>
+              <w:t>.</w:t>
+            </w:r>
           </w:p>
           <w:p>
             <w:pPr>
@@ -3122,7 +3275,23 @@
                 <w:sz w:val="14"/>
                 <w:lang w:val="ru-RU"/>
               </w:rPr>
-              <w:t>Подпись                          Расшифровка</w:t>
+              <w:t>Подпись</w:t>
+            </w:r>
+            <w:r>
+              <w:rPr>
+                <w:color w:val="74777B"/>
+                <w:sz w:val="14"/>
+                <w:lang w:val="ru-RU"/>
+              </w:rPr>
+              <w:t xml:space="preserve">      М.П.</w:t>
+            </w:r>
+            <w:r>
+              <w:rPr>
+                <w:color w:val="74777B"/>
+                <w:sz w:val="14"/>
+                <w:lang w:val="ru-RU"/>
+              </w:rPr>
+              <w:t xml:space="preserve">            Расшифровка</w:t>
             </w:r>
           </w:p>
         </w:tc>
@@ -3184,9 +3353,48 @@
       <w:rPr>
         <w:color w:val="74777B"/>
         <w:sz w:val="14"/>
+      </w:rPr>
+      <w:t>CRM</w:t>
+    </w:r>
+    <w:r>
+      <w:rPr>
+        <w:color w:val="74777B"/>
+        <w:sz w:val="14"/>
         <w:lang w:val="ru-RU"/>
       </w:rPr>
-      <w:t>НОВЫЙ ПРОЕКТ   /   ЗАЯВКА НА ПЕРЕВОЗКУ</w:t>
+      <w:t>.</w:t>
+    </w:r>
+    <w:r>
+      <w:rPr>
+        <w:color w:val="74777B"/>
+        <w:sz w:val="14"/>
+        <w:lang w:val="ru-RU"/>
+      </w:rPr>
+      <w:t xml:space="preserve">Экспедитор   </w:t>
+    </w:r>
+    <w:r>
+      <w:rPr>
+        <w:color w:val="74777B"/>
+        <w:sz w:val="14"/>
+        <w:lang w:val="ru-RU"/>
+      </w:rPr>
+      <w:t>/</w:t>
+    </w:r>
+    <w:r>
+      <w:rPr>
+        <w:color w:val="74777B"/>
+        <w:sz w:val="14"/>
+        <w:lang w:val="ru-RU"/>
+      </w:rPr>
+      <w:t xml:space="preserve">   </w:t>
+    </w:r>
+    <w:r>
+      <w:rPr>
+        <w:color w:val="74777B"/>
+        <w:sz w:val="14"/>
+        <w:lang w:val="ru-RU"/>
+      </w:rPr>
+      <w:t>ЗАЯВКА НА ПЕРЕВОЗКУ</w:t>
     </w:r>
     <w:r>
       <w:rPr>

</xml_diff>